<commit_message>
Add transportation-aware hero workflow
</commit_message>
<xml_diff>
--- a/docs/Family_Activity_Deep_Agent_Project_Documentation.docx
+++ b/docs/Family_Activity_Deep_Agent_Project_Documentation.docx
@@ -47,7 +47,7 @@
           <w:color w:val="000000"/>
           <w:sz w:val="22"/>
         </w:rPr>
-        <w:t>Working CLI MVP with Deep Agents, LangGraph, Groq, MCP tools, SQLite persistence, human approval, deterministic validation, offline evaluations, and optional LangSmith tracing.</w:t>
+        <w:t>Working CLI MVP with Deep Agents, LangGraph, Nebius Nemotron, MCP tools, SQLite persistence, human approval, deterministic validation, offline evaluations, and optional LangSmith tracing.</w:t>
       </w:r>
     </w:p>
     <w:p>
@@ -86,7 +86,7 @@
     </w:p>
     <w:p>
       <w:r>
-        <w:t>My agent helps parents coordinate family activities in a CLI-backed shared calendar, replacing scattered messages and manual cross-checking. It autonomously resolves requests, reads calendar state, checks conflicts, and drafts reminders using 10 MCP tools; it hands off to a parent before every create, update, delete, restore, or reminder change, and succeeds when a parent can complete a calendar task in under two minutes with no unapproved writes.</w:t>
+        <w:t>My agent helps parents coordinate family activities in a CLI-backed shared calendar, replacing scattered messages and manual cross-checking. It autonomously resolves requests, reads family and school-calendar state, generates ranked transportation-aware weekly options, reviews plans, checks conflicts, and drafts reminders using 17 MCP tools; it hands off to a parent before every create, update, delete, restore, or reminder change, and succeeds when a parent can complete a calendar task with no unapproved writes.</w:t>
       </w:r>
     </w:p>
     <w:p>
@@ -292,7 +292,7 @@
           <w:color w:val="000000"/>
           <w:sz w:val="22"/>
         </w:rPr>
-        <w:t>Recurring-event series editing and transportation optimization.</w:t>
+        <w:t>Recurring-event series editing and live traffic-aware route optimization.</w:t>
       </w:r>
     </w:p>
     <w:p>
@@ -335,6 +335,12 @@
         <w:br/>
         <w:t xml:space="preserve">    ├── Conflict Agent ─── overlap analysis</w:t>
         <w:br/>
+        <w:t xml:space="preserve">    ├── Weekly Planner ─── weekly context</w:t>
+        <w:br/>
+        <w:t xml:space="preserve">    ├── Transportation ─── ranked assignment candidates</w:t>
+        <w:br/>
+        <w:t xml:space="preserve">    ├── Schedule Reviewer  independent review</w:t>
+        <w:br/>
         <w:t xml:space="preserve">    └── Reminder Agent ─── reminder drafts</w:t>
         <w:br/>
         <w:t xml:space="preserve">              │</w:t>
@@ -349,13 +355,13 @@
         <w:br/>
         <w:t xml:space="preserve">       ▼               ▼</w:t>
         <w:br/>
-        <w:t>CalendarRepository   10 typed tools</w:t>
+        <w:t>CalendarRepository   17 typed tools</w:t>
         <w:br/>
         <w:t xml:space="preserve">       │</w:t>
         <w:br/>
         <w:t xml:space="preserve">       ▼</w:t>
         <w:br/>
-        <w:t>SQLite: events + reminders + audit_logs</w:t>
+        <w:t>SQLite: events + reminders + availability_rules + audit_logs</w:t>
       </w:r>
     </w:p>
     <w:p>
@@ -891,6 +897,246 @@
                 <w:sz w:val="20"/>
               </w:rPr>
               <w:t>check_conflicts</w:t>
+            </w:r>
+          </w:p>
+        </w:tc>
+      </w:tr>
+      <w:tr>
+        <w:tc>
+          <w:tcPr>
+            <w:tcW w:type="dxa" w:w="1944"/>
+            <w:vAlign w:val="center"/>
+            <w:tcMar>
+              <w:top w:w="80" w:type="dxa"/>
+              <w:start w:w="120" w:type="dxa"/>
+              <w:bottom w:w="80" w:type="dxa"/>
+              <w:end w:w="120" w:type="dxa"/>
+            </w:tcMar>
+          </w:tcPr>
+          <w:p>
+            <w:pPr>
+              <w:spacing w:after="0"/>
+            </w:pPr>
+            <w:r>
+              <w:rPr>
+                <w:rFonts w:ascii="Arial" w:hAnsi="Arial"/>
+                <w:b w:val="0"/>
+                <w:color w:val="000000"/>
+                <w:sz w:val="20"/>
+              </w:rPr>
+              <w:t>Weekly Planner</w:t>
+            </w:r>
+          </w:p>
+        </w:tc>
+        <w:tc>
+          <w:tcPr>
+            <w:tcW w:type="dxa" w:w="4536"/>
+            <w:vAlign w:val="center"/>
+            <w:tcMar>
+              <w:top w:w="80" w:type="dxa"/>
+              <w:start w:w="120" w:type="dxa"/>
+              <w:bottom w:w="80" w:type="dxa"/>
+              <w:end w:w="120" w:type="dxa"/>
+            </w:tcMar>
+          </w:tcPr>
+          <w:p>
+            <w:pPr>
+              <w:spacing w:after="0"/>
+            </w:pPr>
+            <w:r>
+              <w:rPr>
+                <w:rFonts w:ascii="Arial" w:hAnsi="Arial"/>
+                <w:b w:val="0"/>
+                <w:color w:val="000000"/>
+                <w:sz w:val="20"/>
+              </w:rPr>
+              <w:t>Combines family events, Reed school dates, and proposed parent assignments.</w:t>
+            </w:r>
+          </w:p>
+        </w:tc>
+        <w:tc>
+          <w:tcPr>
+            <w:tcW w:type="dxa" w:w="2880"/>
+            <w:vAlign w:val="center"/>
+            <w:tcMar>
+              <w:top w:w="80" w:type="dxa"/>
+              <w:start w:w="120" w:type="dxa"/>
+              <w:bottom w:w="80" w:type="dxa"/>
+              <w:end w:w="120" w:type="dxa"/>
+            </w:tcMar>
+          </w:tcPr>
+          <w:p>
+            <w:pPr>
+              <w:spacing w:after="0"/>
+            </w:pPr>
+            <w:r>
+              <w:rPr>
+                <w:rFonts w:ascii="Arial" w:hAnsi="Arial"/>
+                <w:b w:val="0"/>
+                <w:color w:val="000000"/>
+                <w:sz w:val="20"/>
+              </w:rPr>
+              <w:t>Read-only calendar and school tools</w:t>
+            </w:r>
+          </w:p>
+        </w:tc>
+      </w:tr>
+      <w:tr>
+        <w:tc>
+          <w:tcPr>
+            <w:tcW w:type="dxa" w:w="1944"/>
+            <w:vAlign w:val="center"/>
+            <w:tcMar>
+              <w:top w:w="80" w:type="dxa"/>
+              <w:start w:w="120" w:type="dxa"/>
+              <w:bottom w:w="80" w:type="dxa"/>
+              <w:end w:w="120" w:type="dxa"/>
+            </w:tcMar>
+          </w:tcPr>
+          <w:p>
+            <w:pPr>
+              <w:spacing w:after="0"/>
+            </w:pPr>
+            <w:r>
+              <w:rPr>
+                <w:rFonts w:ascii="Arial" w:hAnsi="Arial"/>
+                <w:b w:val="0"/>
+                <w:color w:val="000000"/>
+                <w:sz w:val="20"/>
+              </w:rPr>
+              <w:t>Transportation Agent</w:t>
+            </w:r>
+          </w:p>
+        </w:tc>
+        <w:tc>
+          <w:tcPr>
+            <w:tcW w:type="dxa" w:w="4536"/>
+            <w:vAlign w:val="center"/>
+            <w:tcMar>
+              <w:top w:w="80" w:type="dxa"/>
+              <w:start w:w="120" w:type="dxa"/>
+              <w:bottom w:w="80" w:type="dxa"/>
+              <w:end w:w="120" w:type="dxa"/>
+            </w:tcMar>
+          </w:tcPr>
+          <w:p>
+            <w:pPr>
+              <w:spacing w:after="0"/>
+            </w:pPr>
+            <w:r>
+              <w:rPr>
+                <w:rFonts w:ascii="Arial" w:hAnsi="Arial"/>
+                <w:b w:val="0"/>
+                <w:color w:val="000000"/>
+                <w:sz w:val="20"/>
+              </w:rPr>
+              <w:t>Generates ranked assignment and pickup/drop-off candidates.</w:t>
+            </w:r>
+          </w:p>
+        </w:tc>
+        <w:tc>
+          <w:tcPr>
+            <w:tcW w:type="dxa" w:w="2880"/>
+            <w:vAlign w:val="center"/>
+            <w:tcMar>
+              <w:top w:w="80" w:type="dxa"/>
+              <w:start w:w="120" w:type="dxa"/>
+              <w:bottom w:w="80" w:type="dxa"/>
+              <w:end w:w="120" w:type="dxa"/>
+            </w:tcMar>
+          </w:tcPr>
+          <w:p>
+            <w:pPr>
+              <w:spacing w:after="0"/>
+            </w:pPr>
+            <w:r>
+              <w:rPr>
+                <w:rFonts w:ascii="Arial" w:hAnsi="Arial"/>
+                <w:b w:val="0"/>
+                <w:color w:val="000000"/>
+                <w:sz w:val="20"/>
+              </w:rPr>
+              <w:t>Availability, transportation, and candidate tools</w:t>
+            </w:r>
+          </w:p>
+        </w:tc>
+      </w:tr>
+      <w:tr>
+        <w:tc>
+          <w:tcPr>
+            <w:tcW w:type="dxa" w:w="1944"/>
+            <w:vAlign w:val="center"/>
+            <w:tcMar>
+              <w:top w:w="80" w:type="dxa"/>
+              <w:start w:w="120" w:type="dxa"/>
+              <w:bottom w:w="80" w:type="dxa"/>
+              <w:end w:w="120" w:type="dxa"/>
+            </w:tcMar>
+          </w:tcPr>
+          <w:p>
+            <w:pPr>
+              <w:spacing w:after="0"/>
+            </w:pPr>
+            <w:r>
+              <w:rPr>
+                <w:rFonts w:ascii="Arial" w:hAnsi="Arial"/>
+                <w:b w:val="0"/>
+                <w:color w:val="000000"/>
+                <w:sz w:val="20"/>
+              </w:rPr>
+              <w:t>Schedule Reviewer</w:t>
+            </w:r>
+          </w:p>
+        </w:tc>
+        <w:tc>
+          <w:tcPr>
+            <w:tcW w:type="dxa" w:w="4536"/>
+            <w:vAlign w:val="center"/>
+            <w:tcMar>
+              <w:top w:w="80" w:type="dxa"/>
+              <w:start w:w="120" w:type="dxa"/>
+              <w:bottom w:w="80" w:type="dxa"/>
+              <w:end w:w="120" w:type="dxa"/>
+            </w:tcMar>
+          </w:tcPr>
+          <w:p>
+            <w:pPr>
+              <w:spacing w:after="0"/>
+            </w:pPr>
+            <w:r>
+              <w:rPr>
+                <w:rFonts w:ascii="Arial" w:hAnsi="Arial"/>
+                <w:b w:val="0"/>
+                <w:color w:val="000000"/>
+                <w:sz w:val="20"/>
+              </w:rPr>
+              <w:t>Audits a weekly plan and requires revision when blocking issues remain.</w:t>
+            </w:r>
+          </w:p>
+        </w:tc>
+        <w:tc>
+          <w:tcPr>
+            <w:tcW w:type="dxa" w:w="2880"/>
+            <w:vAlign w:val="center"/>
+            <w:tcMar>
+              <w:top w:w="80" w:type="dxa"/>
+              <w:start w:w="120" w:type="dxa"/>
+              <w:bottom w:w="80" w:type="dxa"/>
+              <w:end w:w="120" w:type="dxa"/>
+            </w:tcMar>
+          </w:tcPr>
+          <w:p>
+            <w:pPr>
+              <w:spacing w:after="0"/>
+            </w:pPr>
+            <w:r>
+              <w:rPr>
+                <w:rFonts w:ascii="Arial" w:hAnsi="Arial"/>
+                <w:b w:val="0"/>
+                <w:color w:val="000000"/>
+                <w:sz w:val="20"/>
+              </w:rPr>
+              <w:t>Shared plan and review artifacts</w:t>
             </w:r>
           </w:p>
         </w:tc>
@@ -1778,6 +2024,748 @@
                 <w:color w:val="000000"/>
                 <w:sz w:val="20"/>
               </w:rPr>
+              <w:t>list_school_events</w:t>
+            </w:r>
+          </w:p>
+        </w:tc>
+        <w:tc>
+          <w:tcPr>
+            <w:tcW w:type="dxa" w:w="936"/>
+            <w:vAlign w:val="center"/>
+            <w:tcMar>
+              <w:top w:w="80" w:type="dxa"/>
+              <w:start w:w="120" w:type="dxa"/>
+              <w:bottom w:w="80" w:type="dxa"/>
+              <w:end w:w="120" w:type="dxa"/>
+            </w:tcMar>
+          </w:tcPr>
+          <w:p>
+            <w:pPr>
+              <w:spacing w:after="0"/>
+            </w:pPr>
+            <w:r>
+              <w:rPr>
+                <w:rFonts w:ascii="Arial" w:hAnsi="Arial"/>
+                <w:b w:val="0"/>
+                <w:color w:val="000000"/>
+                <w:sz w:val="20"/>
+              </w:rPr>
+              <w:t>Read</w:t>
+            </w:r>
+          </w:p>
+        </w:tc>
+        <w:tc>
+          <w:tcPr>
+            <w:tcW w:type="dxa" w:w="4536"/>
+            <w:vAlign w:val="center"/>
+            <w:tcMar>
+              <w:top w:w="80" w:type="dxa"/>
+              <w:start w:w="120" w:type="dxa"/>
+              <w:bottom w:w="80" w:type="dxa"/>
+              <w:end w:w="120" w:type="dxa"/>
+            </w:tcMar>
+          </w:tcPr>
+          <w:p>
+            <w:pPr>
+              <w:spacing w:after="0"/>
+            </w:pPr>
+            <w:r>
+              <w:rPr>
+                <w:rFonts w:ascii="Arial" w:hAnsi="Arial"/>
+                <w:b w:val="0"/>
+                <w:color w:val="000000"/>
+                <w:sz w:val="20"/>
+              </w:rPr>
+              <w:t>List Reed Elementary dates in a range.</w:t>
+            </w:r>
+          </w:p>
+        </w:tc>
+        <w:tc>
+          <w:tcPr>
+            <w:tcW w:type="dxa" w:w="1440"/>
+            <w:vAlign w:val="center"/>
+            <w:tcMar>
+              <w:top w:w="80" w:type="dxa"/>
+              <w:start w:w="120" w:type="dxa"/>
+              <w:bottom w:w="80" w:type="dxa"/>
+              <w:end w:w="120" w:type="dxa"/>
+            </w:tcMar>
+          </w:tcPr>
+          <w:p>
+            <w:pPr>
+              <w:spacing w:after="0"/>
+            </w:pPr>
+            <w:r>
+              <w:rPr>
+                <w:rFonts w:ascii="Arial" w:hAnsi="Arial"/>
+                <w:b w:val="0"/>
+                <w:color w:val="000000"/>
+                <w:sz w:val="20"/>
+              </w:rPr>
+              <w:t>No</w:t>
+            </w:r>
+          </w:p>
+        </w:tc>
+      </w:tr>
+      <w:tr>
+        <w:tc>
+          <w:tcPr>
+            <w:tcW w:type="dxa" w:w="2448"/>
+            <w:vAlign w:val="center"/>
+            <w:tcMar>
+              <w:top w:w="80" w:type="dxa"/>
+              <w:start w:w="120" w:type="dxa"/>
+              <w:bottom w:w="80" w:type="dxa"/>
+              <w:end w:w="120" w:type="dxa"/>
+            </w:tcMar>
+          </w:tcPr>
+          <w:p>
+            <w:pPr>
+              <w:spacing w:after="0"/>
+            </w:pPr>
+            <w:r>
+              <w:rPr>
+                <w:rFonts w:ascii="Arial" w:hAnsi="Arial"/>
+                <w:b w:val="0"/>
+                <w:color w:val="000000"/>
+                <w:sz w:val="20"/>
+              </w:rPr>
+              <w:t>check_school_conflicts</w:t>
+            </w:r>
+          </w:p>
+        </w:tc>
+        <w:tc>
+          <w:tcPr>
+            <w:tcW w:type="dxa" w:w="936"/>
+            <w:vAlign w:val="center"/>
+            <w:tcMar>
+              <w:top w:w="80" w:type="dxa"/>
+              <w:start w:w="120" w:type="dxa"/>
+              <w:bottom w:w="80" w:type="dxa"/>
+              <w:end w:w="120" w:type="dxa"/>
+            </w:tcMar>
+          </w:tcPr>
+          <w:p>
+            <w:pPr>
+              <w:spacing w:after="0"/>
+            </w:pPr>
+            <w:r>
+              <w:rPr>
+                <w:rFonts w:ascii="Arial" w:hAnsi="Arial"/>
+                <w:b w:val="0"/>
+                <w:color w:val="000000"/>
+                <w:sz w:val="20"/>
+              </w:rPr>
+              <w:t>Read</w:t>
+            </w:r>
+          </w:p>
+        </w:tc>
+        <w:tc>
+          <w:tcPr>
+            <w:tcW w:type="dxa" w:w="4536"/>
+            <w:vAlign w:val="center"/>
+            <w:tcMar>
+              <w:top w:w="80" w:type="dxa"/>
+              <w:start w:w="120" w:type="dxa"/>
+              <w:bottom w:w="80" w:type="dxa"/>
+              <w:end w:w="120" w:type="dxa"/>
+            </w:tcMar>
+          </w:tcPr>
+          <w:p>
+            <w:pPr>
+              <w:spacing w:after="0"/>
+            </w:pPr>
+            <w:r>
+              <w:rPr>
+                <w:rFonts w:ascii="Arial" w:hAnsi="Arial"/>
+                <w:b w:val="0"/>
+                <w:color w:val="000000"/>
+                <w:sz w:val="20"/>
+              </w:rPr>
+              <w:t>Check school hours, closures, early dismissal, and timed events.</w:t>
+            </w:r>
+          </w:p>
+        </w:tc>
+        <w:tc>
+          <w:tcPr>
+            <w:tcW w:type="dxa" w:w="1440"/>
+            <w:vAlign w:val="center"/>
+            <w:tcMar>
+              <w:top w:w="80" w:type="dxa"/>
+              <w:start w:w="120" w:type="dxa"/>
+              <w:bottom w:w="80" w:type="dxa"/>
+              <w:end w:w="120" w:type="dxa"/>
+            </w:tcMar>
+          </w:tcPr>
+          <w:p>
+            <w:pPr>
+              <w:spacing w:after="0"/>
+            </w:pPr>
+            <w:r>
+              <w:rPr>
+                <w:rFonts w:ascii="Arial" w:hAnsi="Arial"/>
+                <w:b w:val="0"/>
+                <w:color w:val="000000"/>
+                <w:sz w:val="20"/>
+              </w:rPr>
+              <w:t>No</w:t>
+            </w:r>
+          </w:p>
+        </w:tc>
+      </w:tr>
+      <w:tr>
+        <w:tc>
+          <w:tcPr>
+            <w:tcW w:type="dxa" w:w="2448"/>
+            <w:vAlign w:val="center"/>
+            <w:tcMar>
+              <w:top w:w="80" w:type="dxa"/>
+              <w:start w:w="120" w:type="dxa"/>
+              <w:bottom w:w="80" w:type="dxa"/>
+              <w:end w:w="120" w:type="dxa"/>
+            </w:tcMar>
+          </w:tcPr>
+          <w:p>
+            <w:pPr>
+              <w:spacing w:after="0"/>
+            </w:pPr>
+            <w:r>
+              <w:rPr>
+                <w:rFonts w:ascii="Arial" w:hAnsi="Arial"/>
+                <w:b w:val="0"/>
+                <w:color w:val="000000"/>
+                <w:sz w:val="20"/>
+              </w:rPr>
+              <w:t>list_parent_availability</w:t>
+            </w:r>
+          </w:p>
+        </w:tc>
+        <w:tc>
+          <w:tcPr>
+            <w:tcW w:type="dxa" w:w="936"/>
+            <w:vAlign w:val="center"/>
+            <w:tcMar>
+              <w:top w:w="80" w:type="dxa"/>
+              <w:start w:w="120" w:type="dxa"/>
+              <w:bottom w:w="80" w:type="dxa"/>
+              <w:end w:w="120" w:type="dxa"/>
+            </w:tcMar>
+          </w:tcPr>
+          <w:p>
+            <w:pPr>
+              <w:spacing w:after="0"/>
+            </w:pPr>
+            <w:r>
+              <w:rPr>
+                <w:rFonts w:ascii="Arial" w:hAnsi="Arial"/>
+                <w:b w:val="0"/>
+                <w:color w:val="000000"/>
+                <w:sz w:val="20"/>
+              </w:rPr>
+              <w:t>Read</w:t>
+            </w:r>
+          </w:p>
+        </w:tc>
+        <w:tc>
+          <w:tcPr>
+            <w:tcW w:type="dxa" w:w="4536"/>
+            <w:vAlign w:val="center"/>
+            <w:tcMar>
+              <w:top w:w="80" w:type="dxa"/>
+              <w:start w:w="120" w:type="dxa"/>
+              <w:bottom w:w="80" w:type="dxa"/>
+              <w:end w:w="120" w:type="dxa"/>
+            </w:tcMar>
+          </w:tcPr>
+          <w:p>
+            <w:pPr>
+              <w:spacing w:after="0"/>
+            </w:pPr>
+            <w:r>
+              <w:rPr>
+                <w:rFonts w:ascii="Arial" w:hAnsi="Arial"/>
+                <w:b w:val="0"/>
+                <w:color w:val="000000"/>
+                <w:sz w:val="20"/>
+              </w:rPr>
+              <w:t>List structured parent unavailability rules.</w:t>
+            </w:r>
+          </w:p>
+        </w:tc>
+        <w:tc>
+          <w:tcPr>
+            <w:tcW w:type="dxa" w:w="1440"/>
+            <w:vAlign w:val="center"/>
+            <w:tcMar>
+              <w:top w:w="80" w:type="dxa"/>
+              <w:start w:w="120" w:type="dxa"/>
+              <w:bottom w:w="80" w:type="dxa"/>
+              <w:end w:w="120" w:type="dxa"/>
+            </w:tcMar>
+          </w:tcPr>
+          <w:p>
+            <w:pPr>
+              <w:spacing w:after="0"/>
+            </w:pPr>
+            <w:r>
+              <w:rPr>
+                <w:rFonts w:ascii="Arial" w:hAnsi="Arial"/>
+                <w:b w:val="0"/>
+                <w:color w:val="000000"/>
+                <w:sz w:val="20"/>
+              </w:rPr>
+              <w:t>No</w:t>
+            </w:r>
+          </w:p>
+        </w:tc>
+      </w:tr>
+      <w:tr>
+        <w:tc>
+          <w:tcPr>
+            <w:tcW w:type="dxa" w:w="2448"/>
+            <w:vAlign w:val="center"/>
+            <w:tcMar>
+              <w:top w:w="80" w:type="dxa"/>
+              <w:start w:w="120" w:type="dxa"/>
+              <w:bottom w:w="80" w:type="dxa"/>
+              <w:end w:w="120" w:type="dxa"/>
+            </w:tcMar>
+          </w:tcPr>
+          <w:p>
+            <w:pPr>
+              <w:spacing w:after="0"/>
+            </w:pPr>
+            <w:r>
+              <w:rPr>
+                <w:rFonts w:ascii="Arial" w:hAnsi="Arial"/>
+                <w:b w:val="0"/>
+                <w:color w:val="000000"/>
+                <w:sz w:val="20"/>
+              </w:rPr>
+              <w:t>check_parent_availability</w:t>
+            </w:r>
+          </w:p>
+        </w:tc>
+        <w:tc>
+          <w:tcPr>
+            <w:tcW w:type="dxa" w:w="936"/>
+            <w:vAlign w:val="center"/>
+            <w:tcMar>
+              <w:top w:w="80" w:type="dxa"/>
+              <w:start w:w="120" w:type="dxa"/>
+              <w:bottom w:w="80" w:type="dxa"/>
+              <w:end w:w="120" w:type="dxa"/>
+            </w:tcMar>
+          </w:tcPr>
+          <w:p>
+            <w:pPr>
+              <w:spacing w:after="0"/>
+            </w:pPr>
+            <w:r>
+              <w:rPr>
+                <w:rFonts w:ascii="Arial" w:hAnsi="Arial"/>
+                <w:b w:val="0"/>
+                <w:color w:val="000000"/>
+                <w:sz w:val="20"/>
+              </w:rPr>
+              <w:t>Read</w:t>
+            </w:r>
+          </w:p>
+        </w:tc>
+        <w:tc>
+          <w:tcPr>
+            <w:tcW w:type="dxa" w:w="4536"/>
+            <w:vAlign w:val="center"/>
+            <w:tcMar>
+              <w:top w:w="80" w:type="dxa"/>
+              <w:start w:w="120" w:type="dxa"/>
+              <w:bottom w:w="80" w:type="dxa"/>
+              <w:end w:w="120" w:type="dxa"/>
+            </w:tcMar>
+          </w:tcPr>
+          <w:p>
+            <w:pPr>
+              <w:spacing w:after="0"/>
+            </w:pPr>
+            <w:r>
+              <w:rPr>
+                <w:rFonts w:ascii="Arial" w:hAnsi="Arial"/>
+                <w:b w:val="0"/>
+                <w:color w:val="000000"/>
+                <w:sz w:val="20"/>
+              </w:rPr>
+              <w:t>Validate a proposed responsibility against availability.</w:t>
+            </w:r>
+          </w:p>
+        </w:tc>
+        <w:tc>
+          <w:tcPr>
+            <w:tcW w:type="dxa" w:w="1440"/>
+            <w:vAlign w:val="center"/>
+            <w:tcMar>
+              <w:top w:w="80" w:type="dxa"/>
+              <w:start w:w="120" w:type="dxa"/>
+              <w:bottom w:w="80" w:type="dxa"/>
+              <w:end w:w="120" w:type="dxa"/>
+            </w:tcMar>
+          </w:tcPr>
+          <w:p>
+            <w:pPr>
+              <w:spacing w:after="0"/>
+            </w:pPr>
+            <w:r>
+              <w:rPr>
+                <w:rFonts w:ascii="Arial" w:hAnsi="Arial"/>
+                <w:b w:val="0"/>
+                <w:color w:val="000000"/>
+                <w:sz w:val="20"/>
+              </w:rPr>
+              <w:t>No</w:t>
+            </w:r>
+          </w:p>
+        </w:tc>
+      </w:tr>
+      <w:tr>
+        <w:tc>
+          <w:tcPr>
+            <w:tcW w:type="dxa" w:w="2448"/>
+            <w:vAlign w:val="center"/>
+            <w:tcMar>
+              <w:top w:w="80" w:type="dxa"/>
+              <w:start w:w="120" w:type="dxa"/>
+              <w:bottom w:w="80" w:type="dxa"/>
+              <w:end w:w="120" w:type="dxa"/>
+            </w:tcMar>
+          </w:tcPr>
+          <w:p>
+            <w:pPr>
+              <w:spacing w:after="0"/>
+            </w:pPr>
+            <w:r>
+              <w:rPr>
+                <w:rFonts w:ascii="Arial" w:hAnsi="Arial"/>
+                <w:b w:val="0"/>
+                <w:color w:val="000000"/>
+                <w:sz w:val="20"/>
+              </w:rPr>
+              <w:t>check_transportation_conflicts</w:t>
+            </w:r>
+          </w:p>
+        </w:tc>
+        <w:tc>
+          <w:tcPr>
+            <w:tcW w:type="dxa" w:w="936"/>
+            <w:vAlign w:val="center"/>
+            <w:tcMar>
+              <w:top w:w="80" w:type="dxa"/>
+              <w:start w:w="120" w:type="dxa"/>
+              <w:bottom w:w="80" w:type="dxa"/>
+              <w:end w:w="120" w:type="dxa"/>
+            </w:tcMar>
+          </w:tcPr>
+          <w:p>
+            <w:pPr>
+              <w:spacing w:after="0"/>
+            </w:pPr>
+            <w:r>
+              <w:rPr>
+                <w:rFonts w:ascii="Arial" w:hAnsi="Arial"/>
+                <w:b w:val="0"/>
+                <w:color w:val="000000"/>
+                <w:sz w:val="20"/>
+              </w:rPr>
+              <w:t>Read</w:t>
+            </w:r>
+          </w:p>
+        </w:tc>
+        <w:tc>
+          <w:tcPr>
+            <w:tcW w:type="dxa" w:w="4536"/>
+            <w:vAlign w:val="center"/>
+            <w:tcMar>
+              <w:top w:w="80" w:type="dxa"/>
+              <w:start w:w="120" w:type="dxa"/>
+              <w:bottom w:w="80" w:type="dxa"/>
+              <w:end w:w="120" w:type="dxa"/>
+            </w:tcMar>
+          </w:tcPr>
+          <w:p>
+            <w:pPr>
+              <w:spacing w:after="0"/>
+            </w:pPr>
+            <w:r>
+              <w:rPr>
+                <w:rFonts w:ascii="Arial" w:hAnsi="Arial"/>
+                <w:b w:val="0"/>
+                <w:color w:val="000000"/>
+                <w:sz w:val="20"/>
+              </w:rPr>
+              <w:t>Check coverage, overlaps, and travel buffers.</w:t>
+            </w:r>
+          </w:p>
+        </w:tc>
+        <w:tc>
+          <w:tcPr>
+            <w:tcW w:type="dxa" w:w="1440"/>
+            <w:vAlign w:val="center"/>
+            <w:tcMar>
+              <w:top w:w="80" w:type="dxa"/>
+              <w:start w:w="120" w:type="dxa"/>
+              <w:bottom w:w="80" w:type="dxa"/>
+              <w:end w:w="120" w:type="dxa"/>
+            </w:tcMar>
+          </w:tcPr>
+          <w:p>
+            <w:pPr>
+              <w:spacing w:after="0"/>
+            </w:pPr>
+            <w:r>
+              <w:rPr>
+                <w:rFonts w:ascii="Arial" w:hAnsi="Arial"/>
+                <w:b w:val="0"/>
+                <w:color w:val="000000"/>
+                <w:sz w:val="20"/>
+              </w:rPr>
+              <w:t>No</w:t>
+            </w:r>
+          </w:p>
+        </w:tc>
+      </w:tr>
+      <w:tr>
+        <w:tc>
+          <w:tcPr>
+            <w:tcW w:type="dxa" w:w="2448"/>
+            <w:vAlign w:val="center"/>
+            <w:tcMar>
+              <w:top w:w="80" w:type="dxa"/>
+              <w:start w:w="120" w:type="dxa"/>
+              <w:bottom w:w="80" w:type="dxa"/>
+              <w:end w:w="120" w:type="dxa"/>
+            </w:tcMar>
+          </w:tcPr>
+          <w:p>
+            <w:pPr>
+              <w:spacing w:after="0"/>
+            </w:pPr>
+            <w:r>
+              <w:rPr>
+                <w:rFonts w:ascii="Arial" w:hAnsi="Arial"/>
+                <w:b w:val="0"/>
+                <w:color w:val="000000"/>
+                <w:sz w:val="20"/>
+              </w:rPr>
+              <w:t>generate_schedule_candidates</w:t>
+            </w:r>
+          </w:p>
+        </w:tc>
+        <w:tc>
+          <w:tcPr>
+            <w:tcW w:type="dxa" w:w="936"/>
+            <w:vAlign w:val="center"/>
+            <w:tcMar>
+              <w:top w:w="80" w:type="dxa"/>
+              <w:start w:w="120" w:type="dxa"/>
+              <w:bottom w:w="80" w:type="dxa"/>
+              <w:end w:w="120" w:type="dxa"/>
+            </w:tcMar>
+          </w:tcPr>
+          <w:p>
+            <w:pPr>
+              <w:spacing w:after="0"/>
+            </w:pPr>
+            <w:r>
+              <w:rPr>
+                <w:rFonts w:ascii="Arial" w:hAnsi="Arial"/>
+                <w:b w:val="0"/>
+                <w:color w:val="000000"/>
+                <w:sz w:val="20"/>
+              </w:rPr>
+              <w:t>Read</w:t>
+            </w:r>
+          </w:p>
+        </w:tc>
+        <w:tc>
+          <w:tcPr>
+            <w:tcW w:type="dxa" w:w="4536"/>
+            <w:vAlign w:val="center"/>
+            <w:tcMar>
+              <w:top w:w="80" w:type="dxa"/>
+              <w:start w:w="120" w:type="dxa"/>
+              <w:bottom w:w="80" w:type="dxa"/>
+              <w:end w:w="120" w:type="dxa"/>
+            </w:tcMar>
+          </w:tcPr>
+          <w:p>
+            <w:pPr>
+              <w:spacing w:after="0"/>
+            </w:pPr>
+            <w:r>
+              <w:rPr>
+                <w:rFonts w:ascii="Arial" w:hAnsi="Arial"/>
+                <w:b w:val="0"/>
+                <w:color w:val="000000"/>
+                <w:sz w:val="20"/>
+              </w:rPr>
+              <w:t>Generate and rank versioned weekly assignment options.</w:t>
+            </w:r>
+          </w:p>
+        </w:tc>
+        <w:tc>
+          <w:tcPr>
+            <w:tcW w:type="dxa" w:w="1440"/>
+            <w:vAlign w:val="center"/>
+            <w:tcMar>
+              <w:top w:w="80" w:type="dxa"/>
+              <w:start w:w="120" w:type="dxa"/>
+              <w:bottom w:w="80" w:type="dxa"/>
+              <w:end w:w="120" w:type="dxa"/>
+            </w:tcMar>
+          </w:tcPr>
+          <w:p>
+            <w:pPr>
+              <w:spacing w:after="0"/>
+            </w:pPr>
+            <w:r>
+              <w:rPr>
+                <w:rFonts w:ascii="Arial" w:hAnsi="Arial"/>
+                <w:b w:val="0"/>
+                <w:color w:val="000000"/>
+                <w:sz w:val="20"/>
+              </w:rPr>
+              <w:t>No</w:t>
+            </w:r>
+          </w:p>
+        </w:tc>
+      </w:tr>
+      <w:tr>
+        <w:tc>
+          <w:tcPr>
+            <w:tcW w:type="dxa" w:w="2448"/>
+            <w:vAlign w:val="center"/>
+            <w:tcMar>
+              <w:top w:w="80" w:type="dxa"/>
+              <w:start w:w="120" w:type="dxa"/>
+              <w:bottom w:w="80" w:type="dxa"/>
+              <w:end w:w="120" w:type="dxa"/>
+            </w:tcMar>
+          </w:tcPr>
+          <w:p>
+            <w:pPr>
+              <w:spacing w:after="0"/>
+            </w:pPr>
+            <w:r>
+              <w:rPr>
+                <w:rFonts w:ascii="Arial" w:hAnsi="Arial"/>
+                <w:b w:val="0"/>
+                <w:color w:val="000000"/>
+                <w:sz w:val="20"/>
+              </w:rPr>
+              <w:t>review_schedule_candidate</w:t>
+            </w:r>
+          </w:p>
+        </w:tc>
+        <w:tc>
+          <w:tcPr>
+            <w:tcW w:type="dxa" w:w="936"/>
+            <w:vAlign w:val="center"/>
+            <w:tcMar>
+              <w:top w:w="80" w:type="dxa"/>
+              <w:start w:w="120" w:type="dxa"/>
+              <w:bottom w:w="80" w:type="dxa"/>
+              <w:end w:w="120" w:type="dxa"/>
+            </w:tcMar>
+          </w:tcPr>
+          <w:p>
+            <w:pPr>
+              <w:spacing w:after="0"/>
+            </w:pPr>
+            <w:r>
+              <w:rPr>
+                <w:rFonts w:ascii="Arial" w:hAnsi="Arial"/>
+                <w:b w:val="0"/>
+                <w:color w:val="000000"/>
+                <w:sz w:val="20"/>
+              </w:rPr>
+              <w:t>Read</w:t>
+            </w:r>
+          </w:p>
+        </w:tc>
+        <w:tc>
+          <w:tcPr>
+            <w:tcW w:type="dxa" w:w="4536"/>
+            <w:vAlign w:val="center"/>
+            <w:tcMar>
+              <w:top w:w="80" w:type="dxa"/>
+              <w:start w:w="120" w:type="dxa"/>
+              <w:bottom w:w="80" w:type="dxa"/>
+              <w:end w:w="120" w:type="dxa"/>
+            </w:tcMar>
+          </w:tcPr>
+          <w:p>
+            <w:pPr>
+              <w:spacing w:after="0"/>
+            </w:pPr>
+            <w:r>
+              <w:rPr>
+                <w:rFonts w:ascii="Arial" w:hAnsi="Arial"/>
+                <w:b w:val="0"/>
+                <w:color w:val="000000"/>
+                <w:sz w:val="20"/>
+              </w:rPr>
+              <w:t>Deterministically review dates, versions, assignments, and school overlaps.</w:t>
+            </w:r>
+          </w:p>
+        </w:tc>
+        <w:tc>
+          <w:tcPr>
+            <w:tcW w:type="dxa" w:w="1440"/>
+            <w:vAlign w:val="center"/>
+            <w:tcMar>
+              <w:top w:w="80" w:type="dxa"/>
+              <w:start w:w="120" w:type="dxa"/>
+              <w:bottom w:w="80" w:type="dxa"/>
+              <w:end w:w="120" w:type="dxa"/>
+            </w:tcMar>
+          </w:tcPr>
+          <w:p>
+            <w:pPr>
+              <w:spacing w:after="0"/>
+            </w:pPr>
+            <w:r>
+              <w:rPr>
+                <w:rFonts w:ascii="Arial" w:hAnsi="Arial"/>
+                <w:b w:val="0"/>
+                <w:color w:val="000000"/>
+                <w:sz w:val="20"/>
+              </w:rPr>
+              <w:t>No</w:t>
+            </w:r>
+          </w:p>
+        </w:tc>
+      </w:tr>
+      <w:tr>
+        <w:tc>
+          <w:tcPr>
+            <w:tcW w:type="dxa" w:w="2448"/>
+            <w:vAlign w:val="center"/>
+            <w:tcMar>
+              <w:top w:w="80" w:type="dxa"/>
+              <w:start w:w="120" w:type="dxa"/>
+              <w:bottom w:w="80" w:type="dxa"/>
+              <w:end w:w="120" w:type="dxa"/>
+            </w:tcMar>
+          </w:tcPr>
+          <w:p>
+            <w:pPr>
+              <w:spacing w:after="0"/>
+            </w:pPr>
+            <w:r>
+              <w:rPr>
+                <w:rFonts w:ascii="Arial" w:hAnsi="Arial"/>
+                <w:b w:val="0"/>
+                <w:color w:val="000000"/>
+                <w:sz w:val="20"/>
+              </w:rPr>
               <w:t>schedule_reminder</w:t>
             </w:r>
           </w:p>
@@ -2195,7 +3183,7 @@
     </w:p>
     <w:p>
       <w:r>
-        <w:t>No external dataset is required. The application uses synthetic course-demo family data stored in three SQLite tables.</w:t>
+        <w:t>No external dataset is required. The application uses synthetic course-demo family data stored in four SQLite tables.</w:t>
       </w:r>
     </w:p>
     <w:tbl>
@@ -2903,7 +3891,7 @@
                 <w:color w:val="000000"/>
                 <w:sz w:val="20"/>
               </w:rPr>
-              <w:t>Groq 429 / timeout</w:t>
+              <w:t>Nebius 429 / timeout</w:t>
             </w:r>
           </w:p>
         </w:tc>
@@ -3112,7 +4100,7 @@
     </w:p>
     <w:p>
       <w:r>
-        <w:t>The offline suite contains 22 passing tests and does not consume Groq quota. It verifies repository rules plus the actual Deep Agent, LangGraph interrupt/resume flow, MCP subprocess, and SQLite mutation boundary using a deterministic fake chat model.</w:t>
+        <w:t>The offline suite uses a deterministic fake chat model and does not consume Nebius quota. It verifies repository rules plus the actual Deep Agent, LangGraph interrupt/resume flow, MCP subprocess, and SQLite mutation boundary.</w:t>
       </w:r>
     </w:p>
     <w:p>
@@ -3196,7 +4184,7 @@
           <w:color w:val="000000"/>
           <w:sz w:val="22"/>
         </w:rPr>
-        <w:t>Fourteen natural-language evaluation cases with expected tools and outcomes.</w:t>
+        <w:t>Seventeen natural-language evaluation cases with expected tools and outcomes.</w:t>
       </w:r>
     </w:p>
     <w:p>
@@ -3230,7 +4218,7 @@
         <w:br/>
         <w:t>cp .env.example .env</w:t>
         <w:br/>
-        <w:t># Add GROQ_API_KEY. Optionally add LANGSMITH_API_KEY.</w:t>
+        <w:t># Add NEBIUS_API_KEY. Optionally add LANGSMITH_API_KEY.</w:t>
         <w:br/>
         <w:t>pytest</w:t>
         <w:br/>
@@ -3289,7 +4277,7 @@
           <w:color w:val="000000"/>
           <w:sz w:val="22"/>
         </w:rPr>
-        <w:t>Switch the model provider to Groq and reduce latency/tool-message incompatibilities.</w:t>
+        <w:t>Use Nebius Token Factory with Nemotron through its OpenAI-compatible API.</w:t>
       </w:r>
     </w:p>
     <w:p>
@@ -3386,7 +4374,7 @@
           <w:color w:val="000000"/>
           <w:sz w:val="22"/>
         </w:rPr>
-        <w:t>Show the architecture and identify the coordinator, four subagents, MCP server, and SQLite state.</w:t>
+        <w:t>Show the architecture and identify the coordinator, seven subagents, MCP server, school calendar, and SQLite state.</w:t>
       </w:r>
     </w:p>
     <w:p>
@@ -3484,7 +4472,7 @@
           <w:color w:val="000000"/>
           <w:sz w:val="22"/>
         </w:rPr>
-        <w:t>Show pytest output (22 passing) and one LangSmith trace tree using synthetic data.</w:t>
+        <w:t>Show the passing pytest suite and one LangSmith trace tree using synthetic data.</w:t>
       </w:r>
     </w:p>
     <w:p>
@@ -3648,7 +4636,7 @@
                 <w:color w:val="000000"/>
                 <w:sz w:val="20"/>
               </w:rPr>
-              <w:t>GROQ_API_KEY configured</w:t>
+              <w:t>NEBIUS_API_KEY configured</w:t>
             </w:r>
           </w:p>
         </w:tc>
@@ -4657,6 +5645,9 @@
     <w:qFormat/>
     <w:rsid w:val="00FC693F"/>
     <w:pPr>
+      <w:pBdr>
+        <w:bottom w:val="single" w:sz="8" w:space="4" w:color="4F81BD" w:themeColor="accent1"/>
+      </w:pBdr>
       <w:spacing w:after="300" w:line="240" w:lineRule="auto"/>
       <w:contextualSpacing/>
     </w:pPr>

</xml_diff>

<commit_message>
Add verified outing research and calendar demo
</commit_message>
<xml_diff>
--- a/docs/Family_Activity_Deep_Agent_Project_Documentation.docx
+++ b/docs/Family_Activity_Deep_Agent_Project_Documentation.docx
@@ -86,7 +86,7 @@
     </w:p>
     <w:p>
       <w:r>
-        <w:t>My agent helps parents coordinate family activities in a CLI-backed shared calendar, replacing scattered messages and manual cross-checking. It autonomously resolves requests, reads family and school-calendar state, generates ranked transportation-aware weekly options, reviews plans, checks conflicts, and drafts reminders using 17 MCP tools; it hands off to a parent before every create, update, delete, restore, or reminder change, and succeeds when a parent can complete a calendar task with no unapproved writes.</w:t>
+        <w:t>My agent helps parents coordinate family activities and discover cited family outings through a CLI-backed shared calendar. It autonomously reads family and school-calendar state, generates ranked transportation-aware weekly options, searches current web evidence for free weekends and school breaks, reviews plans, checks conflicts, and drafts reminders using 25 MCP tools across a local family server and hosted You.com server; it hands off to a parent before every calendar or reminder change.</w:t>
       </w:r>
     </w:p>
     <w:p>
@@ -250,7 +250,7 @@
           <w:color w:val="000000"/>
           <w:sz w:val="22"/>
         </w:rPr>
-        <w:t>A web or mobile frontend; the course MVP uses a CLI.</w:t>
+        <w:t>Live synchronization between the separate Kinday frontend snapshot and SQLite.</w:t>
       </w:r>
     </w:p>
     <w:p>
@@ -339,6 +339,8 @@
         <w:br/>
         <w:t xml:space="preserve">    ├── Transportation ─── ranked assignment candidates</w:t>
         <w:br/>
+        <w:t xml:space="preserve">    ├── Family Outing ──── cited weekend and school-break ideas</w:t>
+        <w:br/>
         <w:t xml:space="preserve">    ├── Schedule Reviewer  independent review</w:t>
         <w:br/>
         <w:t xml:space="preserve">    └── Reminder Agent ─── reminder drafts</w:t>
@@ -355,7 +357,9 @@
         <w:br/>
         <w:t xml:space="preserve">       ▼               ▼</w:t>
         <w:br/>
-        <w:t>CalendarRepository   17 typed tools</w:t>
+        <w:t>CalendarRepository   18 local tools</w:t>
+        <w:br/>
+        <w:t>You.com MCP Server    7 hosted tools</w:t>
         <w:br/>
         <w:t xml:space="preserve">       │</w:t>
         <w:br/>
@@ -1057,6 +1061,86 @@
                 <w:sz w:val="20"/>
               </w:rPr>
               <w:t>Availability, transportation, and candidate tools</w:t>
+            </w:r>
+          </w:p>
+        </w:tc>
+      </w:tr>
+      <w:tr>
+        <w:tc>
+          <w:tcPr>
+            <w:tcW w:type="dxa" w:w="1944"/>
+            <w:vAlign w:val="center"/>
+            <w:tcMar>
+              <w:top w:w="80" w:type="dxa"/>
+              <w:start w:w="120" w:type="dxa"/>
+              <w:bottom w:w="80" w:type="dxa"/>
+              <w:end w:w="120" w:type="dxa"/>
+            </w:tcMar>
+          </w:tcPr>
+          <w:p>
+            <w:pPr>
+              <w:spacing w:after="0"/>
+            </w:pPr>
+            <w:r>
+              <w:rPr>
+                <w:rFonts w:ascii="Arial" w:hAnsi="Arial"/>
+                <w:b w:val="0"/>
+                <w:color w:val="000000"/>
+                <w:sz w:val="20"/>
+              </w:rPr>
+              <w:t>Family Outing Agent</w:t>
+            </w:r>
+          </w:p>
+        </w:tc>
+        <w:tc>
+          <w:tcPr>
+            <w:tcW w:type="dxa" w:w="4536"/>
+            <w:vAlign w:val="center"/>
+            <w:tcMar>
+              <w:top w:w="80" w:type="dxa"/>
+              <w:start w:w="120" w:type="dxa"/>
+              <w:bottom w:w="80" w:type="dxa"/>
+              <w:end w:w="120" w:type="dxa"/>
+            </w:tcMar>
+          </w:tcPr>
+          <w:p>
+            <w:pPr>
+              <w:spacing w:after="0"/>
+            </w:pPr>
+            <w:r>
+              <w:rPr>
+                <w:rFonts w:ascii="Arial" w:hAnsi="Arial"/>
+                <w:b w:val="0"/>
+                <w:color w:val="000000"/>
+                <w:sz w:val="20"/>
+              </w:rPr>
+              <w:t>Checks free time, searches current sources, and ranks outing ideas.</w:t>
+            </w:r>
+          </w:p>
+        </w:tc>
+        <w:tc>
+          <w:tcPr>
+            <w:tcW w:type="dxa" w:w="2880"/>
+            <w:vAlign w:val="center"/>
+            <w:tcMar>
+              <w:top w:w="80" w:type="dxa"/>
+              <w:start w:w="120" w:type="dxa"/>
+              <w:bottom w:w="80" w:type="dxa"/>
+              <w:end w:w="120" w:type="dxa"/>
+            </w:tcMar>
+          </w:tcPr>
+          <w:p>
+            <w:pPr>
+              <w:spacing w:after="0"/>
+            </w:pPr>
+            <w:r>
+              <w:rPr>
+                <w:rFonts w:ascii="Arial" w:hAnsi="Arial"/>
+                <w:b w:val="0"/>
+                <w:color w:val="000000"/>
+                <w:sz w:val="20"/>
+              </w:rPr>
+              <w:t>Calendar, school, and You.com tools</w:t>
             </w:r>
           </w:p>
         </w:tc>
@@ -2766,6 +2850,854 @@
                 <w:color w:val="000000"/>
                 <w:sz w:val="20"/>
               </w:rPr>
+              <w:t>check_outing_time_window</w:t>
+            </w:r>
+          </w:p>
+        </w:tc>
+        <w:tc>
+          <w:tcPr>
+            <w:tcW w:type="dxa" w:w="936"/>
+            <w:vAlign w:val="center"/>
+            <w:tcMar>
+              <w:top w:w="80" w:type="dxa"/>
+              <w:start w:w="120" w:type="dxa"/>
+              <w:bottom w:w="80" w:type="dxa"/>
+              <w:end w:w="120" w:type="dxa"/>
+            </w:tcMar>
+          </w:tcPr>
+          <w:p>
+            <w:pPr>
+              <w:spacing w:after="0"/>
+            </w:pPr>
+            <w:r>
+              <w:rPr>
+                <w:rFonts w:ascii="Arial" w:hAnsi="Arial"/>
+                <w:b w:val="0"/>
+                <w:color w:val="000000"/>
+                <w:sz w:val="20"/>
+              </w:rPr>
+              <w:t>Read</w:t>
+            </w:r>
+          </w:p>
+        </w:tc>
+        <w:tc>
+          <w:tcPr>
+            <w:tcW w:type="dxa" w:w="4536"/>
+            <w:vAlign w:val="center"/>
+            <w:tcMar>
+              <w:top w:w="80" w:type="dxa"/>
+              <w:start w:w="120" w:type="dxa"/>
+              <w:bottom w:w="80" w:type="dxa"/>
+              <w:end w:w="120" w:type="dxa"/>
+            </w:tcMar>
+          </w:tcPr>
+          <w:p>
+            <w:pPr>
+              <w:spacing w:after="0"/>
+            </w:pPr>
+            <w:r>
+              <w:rPr>
+                <w:rFonts w:ascii="Arial" w:hAnsi="Arial"/>
+                <w:b w:val="0"/>
+                <w:color w:val="000000"/>
+                <w:sz w:val="20"/>
+              </w:rPr>
+              <w:t>Check an outing window against family and school commitments.</w:t>
+            </w:r>
+          </w:p>
+        </w:tc>
+        <w:tc>
+          <w:tcPr>
+            <w:tcW w:type="dxa" w:w="1440"/>
+            <w:vAlign w:val="center"/>
+            <w:tcMar>
+              <w:top w:w="80" w:type="dxa"/>
+              <w:start w:w="120" w:type="dxa"/>
+              <w:bottom w:w="80" w:type="dxa"/>
+              <w:end w:w="120" w:type="dxa"/>
+            </w:tcMar>
+          </w:tcPr>
+          <w:p>
+            <w:pPr>
+              <w:spacing w:after="0"/>
+            </w:pPr>
+            <w:r>
+              <w:rPr>
+                <w:rFonts w:ascii="Arial" w:hAnsi="Arial"/>
+                <w:b w:val="0"/>
+                <w:color w:val="000000"/>
+                <w:sz w:val="20"/>
+              </w:rPr>
+              <w:t>No</w:t>
+            </w:r>
+          </w:p>
+        </w:tc>
+      </w:tr>
+      <w:tr>
+        <w:tc>
+          <w:tcPr>
+            <w:tcW w:type="dxa" w:w="2448"/>
+            <w:vAlign w:val="center"/>
+            <w:tcMar>
+              <w:top w:w="80" w:type="dxa"/>
+              <w:start w:w="120" w:type="dxa"/>
+              <w:bottom w:w="80" w:type="dxa"/>
+              <w:end w:w="120" w:type="dxa"/>
+            </w:tcMar>
+          </w:tcPr>
+          <w:p>
+            <w:pPr>
+              <w:spacing w:after="0"/>
+            </w:pPr>
+            <w:r>
+              <w:rPr>
+                <w:rFonts w:ascii="Arial" w:hAnsi="Arial"/>
+                <w:b w:val="0"/>
+                <w:color w:val="000000"/>
+                <w:sz w:val="20"/>
+              </w:rPr>
+              <w:t>you-search</w:t>
+            </w:r>
+          </w:p>
+        </w:tc>
+        <w:tc>
+          <w:tcPr>
+            <w:tcW w:type="dxa" w:w="936"/>
+            <w:vAlign w:val="center"/>
+            <w:tcMar>
+              <w:top w:w="80" w:type="dxa"/>
+              <w:start w:w="120" w:type="dxa"/>
+              <w:bottom w:w="80" w:type="dxa"/>
+              <w:end w:w="120" w:type="dxa"/>
+            </w:tcMar>
+          </w:tcPr>
+          <w:p>
+            <w:pPr>
+              <w:spacing w:after="0"/>
+            </w:pPr>
+            <w:r>
+              <w:rPr>
+                <w:rFonts w:ascii="Arial" w:hAnsi="Arial"/>
+                <w:b w:val="0"/>
+                <w:color w:val="000000"/>
+                <w:sz w:val="20"/>
+              </w:rPr>
+              <w:t>Read / hosted</w:t>
+            </w:r>
+          </w:p>
+        </w:tc>
+        <w:tc>
+          <w:tcPr>
+            <w:tcW w:type="dxa" w:w="4536"/>
+            <w:vAlign w:val="center"/>
+            <w:tcMar>
+              <w:top w:w="80" w:type="dxa"/>
+              <w:start w:w="120" w:type="dxa"/>
+              <w:bottom w:w="80" w:type="dxa"/>
+              <w:end w:w="120" w:type="dxa"/>
+            </w:tcMar>
+          </w:tcPr>
+          <w:p>
+            <w:pPr>
+              <w:spacing w:after="0"/>
+            </w:pPr>
+            <w:r>
+              <w:rPr>
+                <w:rFonts w:ascii="Arial" w:hAnsi="Arial"/>
+                <w:b w:val="0"/>
+                <w:color w:val="000000"/>
+                <w:sz w:val="20"/>
+              </w:rPr>
+              <w:t>Search current web and news results.</w:t>
+            </w:r>
+          </w:p>
+        </w:tc>
+        <w:tc>
+          <w:tcPr>
+            <w:tcW w:type="dxa" w:w="1440"/>
+            <w:vAlign w:val="center"/>
+            <w:tcMar>
+              <w:top w:w="80" w:type="dxa"/>
+              <w:start w:w="120" w:type="dxa"/>
+              <w:bottom w:w="80" w:type="dxa"/>
+              <w:end w:w="120" w:type="dxa"/>
+            </w:tcMar>
+          </w:tcPr>
+          <w:p>
+            <w:pPr>
+              <w:spacing w:after="0"/>
+            </w:pPr>
+            <w:r>
+              <w:rPr>
+                <w:rFonts w:ascii="Arial" w:hAnsi="Arial"/>
+                <w:b w:val="0"/>
+                <w:color w:val="000000"/>
+                <w:sz w:val="20"/>
+              </w:rPr>
+              <w:t>No</w:t>
+            </w:r>
+          </w:p>
+        </w:tc>
+      </w:tr>
+      <w:tr>
+        <w:tc>
+          <w:tcPr>
+            <w:tcW w:type="dxa" w:w="2448"/>
+            <w:vAlign w:val="center"/>
+            <w:tcMar>
+              <w:top w:w="80" w:type="dxa"/>
+              <w:start w:w="120" w:type="dxa"/>
+              <w:bottom w:w="80" w:type="dxa"/>
+              <w:end w:w="120" w:type="dxa"/>
+            </w:tcMar>
+          </w:tcPr>
+          <w:p>
+            <w:pPr>
+              <w:spacing w:after="0"/>
+            </w:pPr>
+            <w:r>
+              <w:rPr>
+                <w:rFonts w:ascii="Arial" w:hAnsi="Arial"/>
+                <w:b w:val="0"/>
+                <w:color w:val="000000"/>
+                <w:sz w:val="20"/>
+              </w:rPr>
+              <w:t>you-contents</w:t>
+            </w:r>
+          </w:p>
+        </w:tc>
+        <w:tc>
+          <w:tcPr>
+            <w:tcW w:type="dxa" w:w="936"/>
+            <w:vAlign w:val="center"/>
+            <w:tcMar>
+              <w:top w:w="80" w:type="dxa"/>
+              <w:start w:w="120" w:type="dxa"/>
+              <w:bottom w:w="80" w:type="dxa"/>
+              <w:end w:w="120" w:type="dxa"/>
+            </w:tcMar>
+          </w:tcPr>
+          <w:p>
+            <w:pPr>
+              <w:spacing w:after="0"/>
+            </w:pPr>
+            <w:r>
+              <w:rPr>
+                <w:rFonts w:ascii="Arial" w:hAnsi="Arial"/>
+                <w:b w:val="0"/>
+                <w:color w:val="000000"/>
+                <w:sz w:val="20"/>
+              </w:rPr>
+              <w:t>Read / hosted</w:t>
+            </w:r>
+          </w:p>
+        </w:tc>
+        <w:tc>
+          <w:tcPr>
+            <w:tcW w:type="dxa" w:w="4536"/>
+            <w:vAlign w:val="center"/>
+            <w:tcMar>
+              <w:top w:w="80" w:type="dxa"/>
+              <w:start w:w="120" w:type="dxa"/>
+              <w:bottom w:w="80" w:type="dxa"/>
+              <w:end w:w="120" w:type="dxa"/>
+            </w:tcMar>
+          </w:tcPr>
+          <w:p>
+            <w:pPr>
+              <w:spacing w:after="0"/>
+            </w:pPr>
+            <w:r>
+              <w:rPr>
+                <w:rFonts w:ascii="Arial" w:hAnsi="Arial"/>
+                <w:b w:val="0"/>
+                <w:color w:val="000000"/>
+                <w:sz w:val="20"/>
+              </w:rPr>
+              <w:t>Extract page content from selected URLs.</w:t>
+            </w:r>
+          </w:p>
+        </w:tc>
+        <w:tc>
+          <w:tcPr>
+            <w:tcW w:type="dxa" w:w="1440"/>
+            <w:vAlign w:val="center"/>
+            <w:tcMar>
+              <w:top w:w="80" w:type="dxa"/>
+              <w:start w:w="120" w:type="dxa"/>
+              <w:bottom w:w="80" w:type="dxa"/>
+              <w:end w:w="120" w:type="dxa"/>
+            </w:tcMar>
+          </w:tcPr>
+          <w:p>
+            <w:pPr>
+              <w:spacing w:after="0"/>
+            </w:pPr>
+            <w:r>
+              <w:rPr>
+                <w:rFonts w:ascii="Arial" w:hAnsi="Arial"/>
+                <w:b w:val="0"/>
+                <w:color w:val="000000"/>
+                <w:sz w:val="20"/>
+              </w:rPr>
+              <w:t>No</w:t>
+            </w:r>
+          </w:p>
+        </w:tc>
+      </w:tr>
+      <w:tr>
+        <w:tc>
+          <w:tcPr>
+            <w:tcW w:type="dxa" w:w="2448"/>
+            <w:vAlign w:val="center"/>
+            <w:tcMar>
+              <w:top w:w="80" w:type="dxa"/>
+              <w:start w:w="120" w:type="dxa"/>
+              <w:bottom w:w="80" w:type="dxa"/>
+              <w:end w:w="120" w:type="dxa"/>
+            </w:tcMar>
+          </w:tcPr>
+          <w:p>
+            <w:pPr>
+              <w:spacing w:after="0"/>
+            </w:pPr>
+            <w:r>
+              <w:rPr>
+                <w:rFonts w:ascii="Arial" w:hAnsi="Arial"/>
+                <w:b w:val="0"/>
+                <w:color w:val="000000"/>
+                <w:sz w:val="20"/>
+              </w:rPr>
+              <w:t>you-research</w:t>
+            </w:r>
+          </w:p>
+        </w:tc>
+        <w:tc>
+          <w:tcPr>
+            <w:tcW w:type="dxa" w:w="936"/>
+            <w:vAlign w:val="center"/>
+            <w:tcMar>
+              <w:top w:w="80" w:type="dxa"/>
+              <w:start w:w="120" w:type="dxa"/>
+              <w:bottom w:w="80" w:type="dxa"/>
+              <w:end w:w="120" w:type="dxa"/>
+            </w:tcMar>
+          </w:tcPr>
+          <w:p>
+            <w:pPr>
+              <w:spacing w:after="0"/>
+            </w:pPr>
+            <w:r>
+              <w:rPr>
+                <w:rFonts w:ascii="Arial" w:hAnsi="Arial"/>
+                <w:b w:val="0"/>
+                <w:color w:val="000000"/>
+                <w:sz w:val="20"/>
+              </w:rPr>
+              <w:t>Read / hosted</w:t>
+            </w:r>
+          </w:p>
+        </w:tc>
+        <w:tc>
+          <w:tcPr>
+            <w:tcW w:type="dxa" w:w="4536"/>
+            <w:vAlign w:val="center"/>
+            <w:tcMar>
+              <w:top w:w="80" w:type="dxa"/>
+              <w:start w:w="120" w:type="dxa"/>
+              <w:bottom w:w="80" w:type="dxa"/>
+              <w:end w:w="120" w:type="dxa"/>
+            </w:tcMar>
+          </w:tcPr>
+          <w:p>
+            <w:pPr>
+              <w:spacing w:after="0"/>
+            </w:pPr>
+            <w:r>
+              <w:rPr>
+                <w:rFonts w:ascii="Arial" w:hAnsi="Arial"/>
+                <w:b w:val="0"/>
+                <w:color w:val="000000"/>
+                <w:sz w:val="20"/>
+              </w:rPr>
+              <w:t>Run deeper citation-backed multi-source research.</w:t>
+            </w:r>
+          </w:p>
+        </w:tc>
+        <w:tc>
+          <w:tcPr>
+            <w:tcW w:type="dxa" w:w="1440"/>
+            <w:vAlign w:val="center"/>
+            <w:tcMar>
+              <w:top w:w="80" w:type="dxa"/>
+              <w:start w:w="120" w:type="dxa"/>
+              <w:bottom w:w="80" w:type="dxa"/>
+              <w:end w:w="120" w:type="dxa"/>
+            </w:tcMar>
+          </w:tcPr>
+          <w:p>
+            <w:pPr>
+              <w:spacing w:after="0"/>
+            </w:pPr>
+            <w:r>
+              <w:rPr>
+                <w:rFonts w:ascii="Arial" w:hAnsi="Arial"/>
+                <w:b w:val="0"/>
+                <w:color w:val="000000"/>
+                <w:sz w:val="20"/>
+              </w:rPr>
+              <w:t>No</w:t>
+            </w:r>
+          </w:p>
+        </w:tc>
+      </w:tr>
+      <w:tr>
+        <w:tc>
+          <w:tcPr>
+            <w:tcW w:type="dxa" w:w="2448"/>
+            <w:vAlign w:val="center"/>
+            <w:tcMar>
+              <w:top w:w="80" w:type="dxa"/>
+              <w:start w:w="120" w:type="dxa"/>
+              <w:bottom w:w="80" w:type="dxa"/>
+              <w:end w:w="120" w:type="dxa"/>
+            </w:tcMar>
+          </w:tcPr>
+          <w:p>
+            <w:pPr>
+              <w:spacing w:after="0"/>
+            </w:pPr>
+            <w:r>
+              <w:rPr>
+                <w:rFonts w:ascii="Arial" w:hAnsi="Arial"/>
+                <w:b w:val="0"/>
+                <w:color w:val="000000"/>
+                <w:sz w:val="20"/>
+              </w:rPr>
+              <w:t>you-answer</w:t>
+            </w:r>
+          </w:p>
+        </w:tc>
+        <w:tc>
+          <w:tcPr>
+            <w:tcW w:type="dxa" w:w="936"/>
+            <w:vAlign w:val="center"/>
+            <w:tcMar>
+              <w:top w:w="80" w:type="dxa"/>
+              <w:start w:w="120" w:type="dxa"/>
+              <w:bottom w:w="80" w:type="dxa"/>
+              <w:end w:w="120" w:type="dxa"/>
+            </w:tcMar>
+          </w:tcPr>
+          <w:p>
+            <w:pPr>
+              <w:spacing w:after="0"/>
+            </w:pPr>
+            <w:r>
+              <w:rPr>
+                <w:rFonts w:ascii="Arial" w:hAnsi="Arial"/>
+                <w:b w:val="0"/>
+                <w:color w:val="000000"/>
+                <w:sz w:val="20"/>
+              </w:rPr>
+              <w:t>Read / hosted</w:t>
+            </w:r>
+          </w:p>
+        </w:tc>
+        <w:tc>
+          <w:tcPr>
+            <w:tcW w:type="dxa" w:w="4536"/>
+            <w:vAlign w:val="center"/>
+            <w:tcMar>
+              <w:top w:w="80" w:type="dxa"/>
+              <w:start w:w="120" w:type="dxa"/>
+              <w:bottom w:w="80" w:type="dxa"/>
+              <w:end w:w="120" w:type="dxa"/>
+            </w:tcMar>
+          </w:tcPr>
+          <w:p>
+            <w:pPr>
+              <w:spacing w:after="0"/>
+            </w:pPr>
+            <w:r>
+              <w:rPr>
+                <w:rFonts w:ascii="Arial" w:hAnsi="Arial"/>
+                <w:b w:val="0"/>
+                <w:color w:val="000000"/>
+                <w:sz w:val="20"/>
+              </w:rPr>
+              <w:t>Return a concise cited answer.</w:t>
+            </w:r>
+          </w:p>
+        </w:tc>
+        <w:tc>
+          <w:tcPr>
+            <w:tcW w:type="dxa" w:w="1440"/>
+            <w:vAlign w:val="center"/>
+            <w:tcMar>
+              <w:top w:w="80" w:type="dxa"/>
+              <w:start w:w="120" w:type="dxa"/>
+              <w:bottom w:w="80" w:type="dxa"/>
+              <w:end w:w="120" w:type="dxa"/>
+            </w:tcMar>
+          </w:tcPr>
+          <w:p>
+            <w:pPr>
+              <w:spacing w:after="0"/>
+            </w:pPr>
+            <w:r>
+              <w:rPr>
+                <w:rFonts w:ascii="Arial" w:hAnsi="Arial"/>
+                <w:b w:val="0"/>
+                <w:color w:val="000000"/>
+                <w:sz w:val="20"/>
+              </w:rPr>
+              <w:t>No</w:t>
+            </w:r>
+          </w:p>
+        </w:tc>
+      </w:tr>
+      <w:tr>
+        <w:tc>
+          <w:tcPr>
+            <w:tcW w:type="dxa" w:w="2448"/>
+            <w:vAlign w:val="center"/>
+            <w:tcMar>
+              <w:top w:w="80" w:type="dxa"/>
+              <w:start w:w="120" w:type="dxa"/>
+              <w:bottom w:w="80" w:type="dxa"/>
+              <w:end w:w="120" w:type="dxa"/>
+            </w:tcMar>
+          </w:tcPr>
+          <w:p>
+            <w:pPr>
+              <w:spacing w:after="0"/>
+            </w:pPr>
+            <w:r>
+              <w:rPr>
+                <w:rFonts w:ascii="Arial" w:hAnsi="Arial"/>
+                <w:b w:val="0"/>
+                <w:color w:val="000000"/>
+                <w:sz w:val="20"/>
+              </w:rPr>
+              <w:t>you-finance</w:t>
+            </w:r>
+          </w:p>
+        </w:tc>
+        <w:tc>
+          <w:tcPr>
+            <w:tcW w:type="dxa" w:w="936"/>
+            <w:vAlign w:val="center"/>
+            <w:tcMar>
+              <w:top w:w="80" w:type="dxa"/>
+              <w:start w:w="120" w:type="dxa"/>
+              <w:bottom w:w="80" w:type="dxa"/>
+              <w:end w:w="120" w:type="dxa"/>
+            </w:tcMar>
+          </w:tcPr>
+          <w:p>
+            <w:pPr>
+              <w:spacing w:after="0"/>
+            </w:pPr>
+            <w:r>
+              <w:rPr>
+                <w:rFonts w:ascii="Arial" w:hAnsi="Arial"/>
+                <w:b w:val="0"/>
+                <w:color w:val="000000"/>
+                <w:sz w:val="20"/>
+              </w:rPr>
+              <w:t>Read / hosted</w:t>
+            </w:r>
+          </w:p>
+        </w:tc>
+        <w:tc>
+          <w:tcPr>
+            <w:tcW w:type="dxa" w:w="4536"/>
+            <w:vAlign w:val="center"/>
+            <w:tcMar>
+              <w:top w:w="80" w:type="dxa"/>
+              <w:start w:w="120" w:type="dxa"/>
+              <w:bottom w:w="80" w:type="dxa"/>
+              <w:end w:w="120" w:type="dxa"/>
+            </w:tcMar>
+          </w:tcPr>
+          <w:p>
+            <w:pPr>
+              <w:spacing w:after="0"/>
+            </w:pPr>
+            <w:r>
+              <w:rPr>
+                <w:rFonts w:ascii="Arial" w:hAnsi="Arial"/>
+                <w:b w:val="0"/>
+                <w:color w:val="000000"/>
+                <w:sz w:val="20"/>
+              </w:rPr>
+              <w:t>Research finance topics when explicitly relevant.</w:t>
+            </w:r>
+          </w:p>
+        </w:tc>
+        <w:tc>
+          <w:tcPr>
+            <w:tcW w:type="dxa" w:w="1440"/>
+            <w:vAlign w:val="center"/>
+            <w:tcMar>
+              <w:top w:w="80" w:type="dxa"/>
+              <w:start w:w="120" w:type="dxa"/>
+              <w:bottom w:w="80" w:type="dxa"/>
+              <w:end w:w="120" w:type="dxa"/>
+            </w:tcMar>
+          </w:tcPr>
+          <w:p>
+            <w:pPr>
+              <w:spacing w:after="0"/>
+            </w:pPr>
+            <w:r>
+              <w:rPr>
+                <w:rFonts w:ascii="Arial" w:hAnsi="Arial"/>
+                <w:b w:val="0"/>
+                <w:color w:val="000000"/>
+                <w:sz w:val="20"/>
+              </w:rPr>
+              <w:t>No</w:t>
+            </w:r>
+          </w:p>
+        </w:tc>
+      </w:tr>
+      <w:tr>
+        <w:tc>
+          <w:tcPr>
+            <w:tcW w:type="dxa" w:w="2448"/>
+            <w:vAlign w:val="center"/>
+            <w:tcMar>
+              <w:top w:w="80" w:type="dxa"/>
+              <w:start w:w="120" w:type="dxa"/>
+              <w:bottom w:w="80" w:type="dxa"/>
+              <w:end w:w="120" w:type="dxa"/>
+            </w:tcMar>
+          </w:tcPr>
+          <w:p>
+            <w:pPr>
+              <w:spacing w:after="0"/>
+            </w:pPr>
+            <w:r>
+              <w:rPr>
+                <w:rFonts w:ascii="Arial" w:hAnsi="Arial"/>
+                <w:b w:val="0"/>
+                <w:color w:val="000000"/>
+                <w:sz w:val="20"/>
+              </w:rPr>
+              <w:t>you-balance</w:t>
+            </w:r>
+          </w:p>
+        </w:tc>
+        <w:tc>
+          <w:tcPr>
+            <w:tcW w:type="dxa" w:w="936"/>
+            <w:vAlign w:val="center"/>
+            <w:tcMar>
+              <w:top w:w="80" w:type="dxa"/>
+              <w:start w:w="120" w:type="dxa"/>
+              <w:bottom w:w="80" w:type="dxa"/>
+              <w:end w:w="120" w:type="dxa"/>
+            </w:tcMar>
+          </w:tcPr>
+          <w:p>
+            <w:pPr>
+              <w:spacing w:after="0"/>
+            </w:pPr>
+            <w:r>
+              <w:rPr>
+                <w:rFonts w:ascii="Arial" w:hAnsi="Arial"/>
+                <w:b w:val="0"/>
+                <w:color w:val="000000"/>
+                <w:sz w:val="20"/>
+              </w:rPr>
+              <w:t>Read / hosted</w:t>
+            </w:r>
+          </w:p>
+        </w:tc>
+        <w:tc>
+          <w:tcPr>
+            <w:tcW w:type="dxa" w:w="4536"/>
+            <w:vAlign w:val="center"/>
+            <w:tcMar>
+              <w:top w:w="80" w:type="dxa"/>
+              <w:start w:w="120" w:type="dxa"/>
+              <w:bottom w:w="80" w:type="dxa"/>
+              <w:end w:w="120" w:type="dxa"/>
+            </w:tcMar>
+          </w:tcPr>
+          <w:p>
+            <w:pPr>
+              <w:spacing w:after="0"/>
+            </w:pPr>
+            <w:r>
+              <w:rPr>
+                <w:rFonts w:ascii="Arial" w:hAnsi="Arial"/>
+                <w:b w:val="0"/>
+                <w:color w:val="000000"/>
+                <w:sz w:val="20"/>
+              </w:rPr>
+              <w:t>Check remaining You.com API credits.</w:t>
+            </w:r>
+          </w:p>
+        </w:tc>
+        <w:tc>
+          <w:tcPr>
+            <w:tcW w:type="dxa" w:w="1440"/>
+            <w:vAlign w:val="center"/>
+            <w:tcMar>
+              <w:top w:w="80" w:type="dxa"/>
+              <w:start w:w="120" w:type="dxa"/>
+              <w:bottom w:w="80" w:type="dxa"/>
+              <w:end w:w="120" w:type="dxa"/>
+            </w:tcMar>
+          </w:tcPr>
+          <w:p>
+            <w:pPr>
+              <w:spacing w:after="0"/>
+            </w:pPr>
+            <w:r>
+              <w:rPr>
+                <w:rFonts w:ascii="Arial" w:hAnsi="Arial"/>
+                <w:b w:val="0"/>
+                <w:color w:val="000000"/>
+                <w:sz w:val="20"/>
+              </w:rPr>
+              <w:t>No</w:t>
+            </w:r>
+          </w:p>
+        </w:tc>
+      </w:tr>
+      <w:tr>
+        <w:tc>
+          <w:tcPr>
+            <w:tcW w:type="dxa" w:w="2448"/>
+            <w:vAlign w:val="center"/>
+            <w:tcMar>
+              <w:top w:w="80" w:type="dxa"/>
+              <w:start w:w="120" w:type="dxa"/>
+              <w:bottom w:w="80" w:type="dxa"/>
+              <w:end w:w="120" w:type="dxa"/>
+            </w:tcMar>
+          </w:tcPr>
+          <w:p>
+            <w:pPr>
+              <w:spacing w:after="0"/>
+            </w:pPr>
+            <w:r>
+              <w:rPr>
+                <w:rFonts w:ascii="Arial" w:hAnsi="Arial"/>
+                <w:b w:val="0"/>
+                <w:color w:val="000000"/>
+                <w:sz w:val="20"/>
+              </w:rPr>
+              <w:t>you-discover</w:t>
+            </w:r>
+          </w:p>
+        </w:tc>
+        <w:tc>
+          <w:tcPr>
+            <w:tcW w:type="dxa" w:w="936"/>
+            <w:vAlign w:val="center"/>
+            <w:tcMar>
+              <w:top w:w="80" w:type="dxa"/>
+              <w:start w:w="120" w:type="dxa"/>
+              <w:bottom w:w="80" w:type="dxa"/>
+              <w:end w:w="120" w:type="dxa"/>
+            </w:tcMar>
+          </w:tcPr>
+          <w:p>
+            <w:pPr>
+              <w:spacing w:after="0"/>
+            </w:pPr>
+            <w:r>
+              <w:rPr>
+                <w:rFonts w:ascii="Arial" w:hAnsi="Arial"/>
+                <w:b w:val="0"/>
+                <w:color w:val="000000"/>
+                <w:sz w:val="20"/>
+              </w:rPr>
+              <w:t>Read / hosted</w:t>
+            </w:r>
+          </w:p>
+        </w:tc>
+        <w:tc>
+          <w:tcPr>
+            <w:tcW w:type="dxa" w:w="4536"/>
+            <w:vAlign w:val="center"/>
+            <w:tcMar>
+              <w:top w:w="80" w:type="dxa"/>
+              <w:start w:w="120" w:type="dxa"/>
+              <w:bottom w:w="80" w:type="dxa"/>
+              <w:end w:w="120" w:type="dxa"/>
+            </w:tcMar>
+          </w:tcPr>
+          <w:p>
+            <w:pPr>
+              <w:spacing w:after="0"/>
+            </w:pPr>
+            <w:r>
+              <w:rPr>
+                <w:rFonts w:ascii="Arial" w:hAnsi="Arial"/>
+                <w:b w:val="0"/>
+                <w:color w:val="000000"/>
+                <w:sz w:val="20"/>
+              </w:rPr>
+              <w:t>Find an appropriate You.com integration path.</w:t>
+            </w:r>
+          </w:p>
+        </w:tc>
+        <w:tc>
+          <w:tcPr>
+            <w:tcW w:type="dxa" w:w="1440"/>
+            <w:vAlign w:val="center"/>
+            <w:tcMar>
+              <w:top w:w="80" w:type="dxa"/>
+              <w:start w:w="120" w:type="dxa"/>
+              <w:bottom w:w="80" w:type="dxa"/>
+              <w:end w:w="120" w:type="dxa"/>
+            </w:tcMar>
+          </w:tcPr>
+          <w:p>
+            <w:pPr>
+              <w:spacing w:after="0"/>
+            </w:pPr>
+            <w:r>
+              <w:rPr>
+                <w:rFonts w:ascii="Arial" w:hAnsi="Arial"/>
+                <w:b w:val="0"/>
+                <w:color w:val="000000"/>
+                <w:sz w:val="20"/>
+              </w:rPr>
+              <w:t>No</w:t>
+            </w:r>
+          </w:p>
+        </w:tc>
+      </w:tr>
+      <w:tr>
+        <w:tc>
+          <w:tcPr>
+            <w:tcW w:type="dxa" w:w="2448"/>
+            <w:vAlign w:val="center"/>
+            <w:tcMar>
+              <w:top w:w="80" w:type="dxa"/>
+              <w:start w:w="120" w:type="dxa"/>
+              <w:bottom w:w="80" w:type="dxa"/>
+              <w:end w:w="120" w:type="dxa"/>
+            </w:tcMar>
+          </w:tcPr>
+          <w:p>
+            <w:pPr>
+              <w:spacing w:after="0"/>
+            </w:pPr>
+            <w:r>
+              <w:rPr>
+                <w:rFonts w:ascii="Arial" w:hAnsi="Arial"/>
+                <w:b w:val="0"/>
+                <w:color w:val="000000"/>
+                <w:sz w:val="20"/>
+              </w:rPr>
               <w:t>schedule_reminder</w:t>
             </w:r>
           </w:p>
@@ -4184,7 +5116,7 @@
           <w:color w:val="000000"/>
           <w:sz w:val="22"/>
         </w:rPr>
-        <w:t>Seventeen natural-language evaluation cases with expected tools and outcomes.</w:t>
+        <w:t>Twenty-one natural-language evaluation cases with expected tools and outcomes.</w:t>
       </w:r>
     </w:p>
     <w:p>
@@ -4374,7 +5306,7 @@
           <w:color w:val="000000"/>
           <w:sz w:val="22"/>
         </w:rPr>
-        <w:t>Show the architecture and identify the coordinator, seven subagents, MCP server, school calendar, and SQLite state.</w:t>
+        <w:t>Show the architecture and identify the coordinator, eight subagents, MCP server, You.com boundary, school calendar, and SQLite state.</w:t>
       </w:r>
     </w:p>
     <w:p>
@@ -4919,7 +5851,7 @@
     </w:p>
     <w:p>
       <w:r>
-        <w:t>The MVP stops after saving calendar state or reminder drafts. It does not send messages or perform external commitments. Future extensions include Twilio delivery, authenticated family membership, a shared calendar frontend, Google/Apple Calendar synchronization, recurring events, production PostgreSQL, and hosted deployment.</w:t>
+        <w:t>The MVP stops after saving calendar state or reminder drafts. It does not send messages or perform external commitments. A separate hosted Kinday frontend displays a snapshot of the seeded family calendar, but it does not synchronize live with SQLite. Future extensions include Twilio delivery, authenticated family membership, live Kinday synchronization, Google/Apple Calendar synchronization, recurring events, and production PostgreSQL.</w:t>
       </w:r>
     </w:p>
     <w:sectPr>

</xml_diff>